<commit_message>
resolved the yellow and other issues
</commit_message>
<xml_diff>
--- a/Automation/backend/CSS_Proposal_Base_Template.docx
+++ b/Automation/backend/CSS_Proposal_Base_Template.docx
@@ -14,7 +14,7 @@
           <w:highlight w:val="yellow"/>
           <w:rtl w:val="0"/>
         </w:rPr>
-        <w:t xml:space="preserve">EN-01-12-25</w:t>
+        <w:t xml:space="preserve">{{ proposal_ref }}</w:t>
       </w:r>
       <w:r>
         <w:rPr>
@@ -397,12 +397,12 @@
                 <wp:extent cx="5248275" cy="4602480"/>
                 <wp:effectExtent b="0" l="0" r="0" t="0"/>
                 <wp:wrapTopAndBottom distB="0" distT="0"/>
-                <wp:docPr id="3" name="image10.png"/>
+                <wp:docPr id="3" name="image13.png"/>
                 <a:graphic>
                   <a:graphicData uri="http://schemas.openxmlformats.org/drawingml/2006/picture">
                     <pic:pic>
                       <pic:nvPicPr>
-                        <pic:cNvPr id="0" name="image10.png"/>
+                        <pic:cNvPr id="0" name="image13.png"/>
                         <pic:cNvPicPr preferRelativeResize="0"/>
                       </pic:nvPicPr>
                       <pic:blipFill>
@@ -516,7 +516,7 @@
           <w:highlight w:val="yellow"/>
           <w:rtl w:val="0"/>
         </w:rPr>
-        <w:t xml:space="preserve">XYZ LLC</w:t>
+        <w:t xml:space="preserve">{{ client_name }}</w:t>
       </w:r>
       <w:r>
         <w:rPr>
@@ -646,47 +646,7 @@
         </w:rPr>
       </w:pPr>
       <w:r>
-        <w:rPr>
-          <w:sz w:val="24"/>
-          <w:szCs w:val="24"/>
-        </w:rPr>
-        <w:drawing>
-          <wp:inline distB="0" distT="0" distL="0" distR="0">
-            <wp:extent cx="2147407" cy="2105025"/>
-            <wp:effectExtent b="0" l="0" r="0" t="0"/>
-            <wp:docPr descr="Brand logo Images - Free Download on Freepik" id="18" name="image3.jpg"/>
-            <a:graphic>
-              <a:graphicData uri="http://schemas.openxmlformats.org/drawingml/2006/picture">
-                <pic:pic>
-                  <pic:nvPicPr>
-                    <pic:cNvPr descr="Brand logo Images - Free Download on Freepik" id="0" name="image3.jpg"/>
-                    <pic:cNvPicPr preferRelativeResize="0"/>
-                  </pic:nvPicPr>
-                  <pic:blipFill>
-                    <a:blip r:embed="rId13"/>
-                    <a:srcRect b="0" l="0" r="0" t="0"/>
-                    <a:stretch>
-                      <a:fillRect/>
-                    </a:stretch>
-                  </pic:blipFill>
-                  <pic:spPr>
-                    <a:xfrm>
-                      <a:off x="0" y="0"/>
-                      <a:ext cx="2147407" cy="2105025"/>
-                    </a:xfrm>
-                    <a:prstGeom prst="rect"/>
-                    <a:ln/>
-                  </pic:spPr>
-                </pic:pic>
-              </a:graphicData>
-            </a:graphic>
-          </wp:inline>
-        </w:drawing>
-      </w:r>
-      <w:r>
-        <w:rPr>
-          <w:rtl w:val="0"/>
-        </w:rPr>
+        <w:t>{{ client_logo }}</w:t>
       </w:r>
     </w:p>
     <w:p>
@@ -740,7 +700,7 @@
           <w:highlight w:val="yellow"/>
           <w:rtl w:val="0"/>
         </w:rPr>
-        <w:t xml:space="preserve">XYZ LLC</w:t>
+        <w:t xml:space="preserve">{{ client_name }}</w:t>
       </w:r>
       <w:r>
         <w:rPr>
@@ -2742,12 +2702,12 @@
             <wp:extent cx="1274064" cy="2970276"/>
             <wp:effectExtent b="0" l="0" r="0" t="0"/>
             <wp:wrapNone/>
-            <wp:docPr id="22" name="image18.jpg"/>
+            <wp:docPr id="22" name="image7.jpg"/>
             <a:graphic>
               <a:graphicData uri="http://schemas.openxmlformats.org/drawingml/2006/picture">
                 <pic:pic>
                   <pic:nvPicPr>
-                    <pic:cNvPr id="0" name="image18.jpg"/>
+                    <pic:cNvPr id="0" name="image7.jpg"/>
                     <pic:cNvPicPr preferRelativeResize="0"/>
                   </pic:nvPicPr>
                   <pic:blipFill>
@@ -2784,12 +2744,12 @@
             <wp:extent cx="1271015" cy="2970276"/>
             <wp:effectExtent b="0" l="0" r="0" t="0"/>
             <wp:wrapNone/>
-            <wp:docPr id="13" name="image4.jpg"/>
+            <wp:docPr id="13" name="image1.jpg"/>
             <a:graphic>
               <a:graphicData uri="http://schemas.openxmlformats.org/drawingml/2006/picture">
                 <pic:pic>
                   <pic:nvPicPr>
-                    <pic:cNvPr id="0" name="image4.jpg"/>
+                    <pic:cNvPr id="0" name="image1.jpg"/>
                     <pic:cNvPicPr preferRelativeResize="0"/>
                   </pic:nvPicPr>
                   <pic:blipFill>
@@ -2826,12 +2786,12 @@
             <wp:extent cx="1303020" cy="2979420"/>
             <wp:effectExtent b="0" l="0" r="0" t="0"/>
             <wp:wrapNone/>
-            <wp:docPr id="19" name="image6.jpg"/>
+            <wp:docPr id="19" name="image4.jpg"/>
             <a:graphic>
               <a:graphicData uri="http://schemas.openxmlformats.org/drawingml/2006/picture">
                 <pic:pic>
                   <pic:nvPicPr>
-                    <pic:cNvPr id="0" name="image6.jpg"/>
+                    <pic:cNvPr id="0" name="image4.jpg"/>
                     <pic:cNvPicPr preferRelativeResize="0"/>
                   </pic:nvPicPr>
                   <pic:blipFill>
@@ -2916,12 +2876,12 @@
           <wp:inline distB="0" distT="0" distL="0" distR="0">
             <wp:extent cx="2526420" cy="2904363"/>
             <wp:effectExtent b="0" l="0" r="0" t="0"/>
-            <wp:docPr id="23" name="image17.png"/>
+            <wp:docPr id="23" name="image9.png"/>
             <a:graphic>
               <a:graphicData uri="http://schemas.openxmlformats.org/drawingml/2006/picture">
                 <pic:pic>
                   <pic:nvPicPr>
-                    <pic:cNvPr id="0" name="image17.png"/>
+                    <pic:cNvPr id="0" name="image9.png"/>
                     <pic:cNvPicPr preferRelativeResize="0"/>
                   </pic:nvPicPr>
                   <pic:blipFill>
@@ -5214,7 +5174,7 @@
         <w:rPr>
           <w:rtl w:val="0"/>
         </w:rPr>
-        <w:t xml:space="preserve">This proposal is regarding Post Breach Scenario Testing and providing clarity/visibility to XYZ LLC on whether the implemented defenses, particularly antivirus and endpoint protection controls, are working as expected or if there are hidden gaps that allow attacker-style antivirus bypass techniques within the environment. </w:t>
+        <w:t xml:space="preserve">This proposal is regarding Post Breach Scenario Testing and providing clarity/visibility to {{ client_name }} on whether the implemented defenses, particularly antivirus and endpoint protection controls, are working as expected or if there are hidden gaps that allow attacker-style antivirus bypass techniques within the environment. </w:t>
       </w:r>
     </w:p>
     <w:p>
@@ -5257,7 +5217,7 @@
         <w:rPr>
           <w:rtl w:val="0"/>
         </w:rPr>
-        <w:t xml:space="preserve">Conduct a controlled, non-destructive Post Breach Scenario – Antivirus Bypass Assessment simulating realistic attacker techniques against XYZ LLC’s antivirus / endpoint defenses within agreed environments. </w:t>
+        <w:t xml:space="preserve">Conduct a controlled, non-destructive Post Breach Scenario – Antivirus Bypass Assessment simulating realistic attacker techniques against {{ client_name }}’s antivirus / endpoint defenses within agreed environments. </w:t>
       </w:r>
     </w:p>
     <w:p>
@@ -5338,7 +5298,7 @@
         <w:rPr>
           <w:rtl w:val="0"/>
         </w:rPr>
-        <w:t xml:space="preserve">Post breach style Antivirus Bypass Analysis focused on assessing how attacker techniques can evade existing antivirus / EDR solutions within the agreed XYZ LLC environment. </w:t>
+        <w:t xml:space="preserve">Post breach style Antivirus Bypass Analysis focused on assessing how attacker techniques can evade existing antivirus / EDR solutions within the agreed {{ client_name }} environment. </w:t>
       </w:r>
     </w:p>
     <w:p>
@@ -5378,7 +5338,7 @@
         <w:rPr>
           <w:rtl w:val="0"/>
         </w:rPr>
-        <w:t xml:space="preserve">Execution of controlled, non-destructive antivirus bypass techniques aligned to real-world attacker tradecraft, with continuous coordination with XYZ LLC stakeholders. </w:t>
+        <w:t xml:space="preserve">Execution of controlled, non-destructive antivirus bypass techniques aligned to real-world attacker tradecraft, with continuous coordination with {{ client_name }} stakeholders. </w:t>
       </w:r>
     </w:p>
     <w:p>
@@ -5585,7 +5545,7 @@
         <w:rPr>
           <w:rtl w:val="0"/>
         </w:rPr>
-        <w:t xml:space="preserve">The Post Breach Antivirus Bypass Assessment focuses specifically on analysing whether a realistic attacker, having already gained an initial foothold, can bypass XYZ LLC’s antivirus and endpoint security solutions through on-disk and in-memory techniques. The objective is to determine how effectively the current defenses detect, block and log malicious behaviour without causing any destructive impact on the environment. </w:t>
+        <w:t xml:space="preserve">The Post Breach Antivirus Bypass Assessment focuses specifically on analysing whether a realistic attacker, having already gained an initial foothold, can bypass {{ client_name }}’s antivirus and endpoint security solutions through on-disk and in-memory techniques. The objective is to determine how effectively the current defenses detect, block and log malicious behaviour without causing any destructive impact on the environment. </w:t>
       </w:r>
     </w:p>
     <w:p>
@@ -6363,12 +6323,12 @@
                 <wp:extent cx="788670" cy="294005"/>
                 <wp:effectExtent b="0" l="0" r="0" t="0"/>
                 <wp:wrapNone/>
-                <wp:docPr id="8" name="image15.png"/>
+                <wp:docPr id="8" name="image18.png"/>
                 <a:graphic>
                   <a:graphicData uri="http://schemas.openxmlformats.org/drawingml/2006/picture">
                     <pic:pic>
                       <pic:nvPicPr>
-                        <pic:cNvPr id="0" name="image15.png"/>
+                        <pic:cNvPr id="0" name="image18.png"/>
                         <pic:cNvPicPr preferRelativeResize="0"/>
                       </pic:nvPicPr>
                       <pic:blipFill>
@@ -6451,7 +6411,7 @@
           <w:highlight w:val="white"/>
           <w:rtl w:val="0"/>
         </w:rPr>
-        <w:t xml:space="preserve">Post Breach Antivirus Bypass Assessment Environment(s): 01 (within agreed XYZ LLC scope) </w:t>
+        <w:t xml:space="preserve">Post Breach Antivirus Bypass Assessment Environment(s): 01 (within agreed {{ client_name }} scope) </w:t>
       </w:r>
       <w:r>
         <w:rPr>
@@ -6589,7 +6549,7 @@
         <w:rPr>
           <w:rtl w:val="0"/>
         </w:rPr>
-        <w:t xml:space="preserve">Report Discussion sessions with XYZ LLC’s Security, SOC, Infrastructure and Endpoint Management teams. </w:t>
+        <w:t xml:space="preserve">Report Discussion sessions with {{ client_name }}’s Security, SOC, Infrastructure and Endpoint Management teams. </w:t>
       </w:r>
     </w:p>
     <w:p>
@@ -6621,7 +6581,7 @@
         <w:rPr>
           <w:rtl w:val="0"/>
         </w:rPr>
-        <w:t xml:space="preserve">No regulatory certification is provided; however, reports may be used by XYZ LLC for internal audit/compliance submissions. </w:t>
+        <w:t xml:space="preserve">No regulatory certification is provided; however, reports may be used by {{ client_name }} for internal audit/compliance submissions. </w:t>
       </w:r>
     </w:p>
     <w:p>
@@ -6972,7 +6932,7 @@
         <w:rPr>
           <w:rtl w:val="0"/>
         </w:rPr>
-        <w:t xml:space="preserve">To identify antivirus / endpoint specific security gaps and bypass scenarios as a high-priority activity for XYZ LLC. </w:t>
+        <w:t xml:space="preserve">To identify antivirus / endpoint specific security gaps and bypass scenarios as a high-priority activity for {{ client_name }}. </w:t>
       </w:r>
     </w:p>
     <w:p>
@@ -7123,7 +7083,7 @@
         <w:rPr>
           <w:rtl w:val="0"/>
         </w:rPr>
-        <w:t xml:space="preserve">To make XYZ LLC’s antivirus and endpoint defense stack more resilient against real-world post breach techniques. </w:t>
+        <w:t xml:space="preserve">To make {{ client_name }}’s antivirus and endpoint defense stack more resilient against real-world post breach techniques. </w:t>
       </w:r>
     </w:p>
     <w:p>
@@ -8039,7 +7999,7 @@
           <w:szCs w:val="22"/>
           <w:rtl w:val="0"/>
         </w:rPr>
-        <w:t xml:space="preserve">Non-responsive systems, consoles or environments that prevent antivirus bypass testing will be highlighted to XYZ LLC stakeholders for follow-up. </w:t>
+        <w:t xml:space="preserve">Non-responsive systems, consoles or environments that prevent antivirus bypass testing will be highlighted to {{ client_name }} stakeholders for follow-up. </w:t>
       </w:r>
     </w:p>
     <w:p>
@@ -8065,7 +8025,7 @@
           <w:szCs w:val="22"/>
           <w:rtl w:val="0"/>
         </w:rPr>
-        <w:t xml:space="preserve">XYZ LLC teams are expected to maintain repositories of fixes, policy changes and detection content updates derived from this assessment. </w:t>
+        <w:t xml:space="preserve">{{ client_name }} teams are expected to maintain repositories of fixes, policy changes and detection content updates derived from this assessment. </w:t>
       </w:r>
     </w:p>
     <w:p>
@@ -14557,12 +14517,12 @@
             <wp:extent cx="5790000" cy="3271838"/>
             <wp:effectExtent b="0" l="0" r="0" t="0"/>
             <wp:wrapNone/>
-            <wp:docPr descr="C:\Users\Acer\Pictures\s.png" id="21" name="image1.png"/>
+            <wp:docPr descr="C:\Users\Acer\Pictures\s.png" id="21" name="image5.png"/>
             <a:graphic>
               <a:graphicData uri="http://schemas.openxmlformats.org/drawingml/2006/picture">
                 <pic:pic>
                   <pic:nvPicPr>
-                    <pic:cNvPr descr="C:\Users\Acer\Pictures\s.png" id="0" name="image1.png"/>
+                    <pic:cNvPr descr="C:\Users\Acer\Pictures\s.png" id="0" name="image5.png"/>
                     <pic:cNvPicPr preferRelativeResize="0"/>
                   </pic:nvPicPr>
                   <pic:blipFill>
@@ -15543,12 +15503,12 @@
                 <wp:extent cx="788670" cy="294005"/>
                 <wp:effectExtent b="0" l="0" r="0" t="0"/>
                 <wp:wrapNone/>
-                <wp:docPr id="7" name="image14.png"/>
+                <wp:docPr id="7" name="image17.png"/>
                 <a:graphic>
                   <a:graphicData uri="http://schemas.openxmlformats.org/drawingml/2006/picture">
                     <pic:pic>
                       <pic:nvPicPr>
-                        <pic:cNvPr id="0" name="image14.png"/>
+                        <pic:cNvPr id="0" name="image17.png"/>
                         <pic:cNvPicPr preferRelativeResize="0"/>
                       </pic:nvPicPr>
                       <pic:blipFill>
@@ -17481,12 +17441,12 @@
             <wp:extent cx="6439599" cy="3643913"/>
             <wp:effectExtent b="0" l="0" r="0" t="0"/>
             <wp:wrapNone/>
-            <wp:docPr descr="C:\Users\Acer\Pictures\ss.png" id="17" name="image5.png"/>
+            <wp:docPr descr="C:\Users\Acer\Pictures\ss.png" id="17" name="image8.png"/>
             <a:graphic>
               <a:graphicData uri="http://schemas.openxmlformats.org/drawingml/2006/picture">
                 <pic:pic>
                   <pic:nvPicPr>
-                    <pic:cNvPr descr="C:\Users\Acer\Pictures\ss.png" id="0" name="image5.png"/>
+                    <pic:cNvPr descr="C:\Users\Acer\Pictures\ss.png" id="0" name="image8.png"/>
                     <pic:cNvPicPr preferRelativeResize="0"/>
                   </pic:nvPicPr>
                   <pic:blipFill>
@@ -18341,12 +18301,12 @@
                 <wp:extent cx="788670" cy="294005"/>
                 <wp:effectExtent b="0" l="0" r="0" t="0"/>
                 <wp:wrapNone/>
-                <wp:docPr id="6" name="image13.png"/>
+                <wp:docPr id="6" name="image16.png"/>
                 <a:graphic>
                   <a:graphicData uri="http://schemas.openxmlformats.org/drawingml/2006/picture">
                     <pic:pic>
                       <pic:nvPicPr>
-                        <pic:cNvPr id="0" name="image13.png"/>
+                        <pic:cNvPr id="0" name="image16.png"/>
                         <pic:cNvPicPr preferRelativeResize="0"/>
                       </pic:nvPicPr>
                       <pic:blipFill>
@@ -26594,12 +26554,12 @@
           <wp:inline distB="0" distT="0" distL="0" distR="0">
             <wp:extent cx="5731200" cy="3213100"/>
             <wp:effectExtent b="0" l="0" r="0" t="0"/>
-            <wp:docPr descr="C:\Users\Acer\Pictures\sam.png" id="12" name="image16.png"/>
+            <wp:docPr descr="C:\Users\Acer\Pictures\sam.png" id="12" name="image3.png"/>
             <a:graphic>
               <a:graphicData uri="http://schemas.openxmlformats.org/drawingml/2006/picture">
                 <pic:pic>
                   <pic:nvPicPr>
-                    <pic:cNvPr descr="C:\Users\Acer\Pictures\sam.png" id="0" name="image16.png"/>
+                    <pic:cNvPr descr="C:\Users\Acer\Pictures\sam.png" id="0" name="image3.png"/>
                     <pic:cNvPicPr preferRelativeResize="0"/>
                   </pic:nvPicPr>
                   <pic:blipFill>
@@ -37225,7 +37185,7 @@
           <w:szCs w:val="24"/>
           <w:rtl w:val="0"/>
         </w:rPr>
-        <w:t xml:space="preserve">Company name is ready with the entire scope &amp; all the necessary requirements for conducting the tests.</w:t>
+        <w:t xml:space="preserve">{{ client_name }} is ready with the entire scope &amp; all the necessary requirements for conducting the tests.</w:t>
       </w:r>
     </w:p>
     <w:p>
@@ -37404,7 +37364,7 @@
           <w:szCs w:val="24"/>
           <w:rtl w:val="0"/>
         </w:rPr>
-        <w:t xml:space="preserve">CyberSmithSECURE shall provide a one-time recommendation in the report about how to patch the discovered vulnerabilities. However, Company name shall be responsible for performing the actual patching of the said vulnerabilities.</w:t>
+        <w:t xml:space="preserve">CyberSmithSECURE shall provide a one-time recommendation in the report about how to patch the discovered vulnerabilities. However, {{ client_name }} shall be responsible for performing the actual patching of the said vulnerabilities.</w:t>
       </w:r>
       <w:r>
         <w:rPr>
@@ -37434,7 +37394,7 @@
           <w:szCs w:val="24"/>
           <w:rtl w:val="0"/>
         </w:rPr>
-        <w:t xml:space="preserve">If additional help is required, Company name is requested to contact us for enabling our Patch Management Service that provides full-service patching of all vulnerabilities using Secure Code experts and professionals.</w:t>
+        <w:t xml:space="preserve">If additional help is required, {{ client_name }} is requested to contact us for enabling our Patch Management Service that provides full-service patching of all vulnerabilities using Secure Code experts and professionals.</w:t>
       </w:r>
       <w:r>
         <w:rPr>
@@ -37464,7 +37424,7 @@
           <w:szCs w:val="24"/>
           <w:rtl w:val="0"/>
         </w:rPr>
-        <w:t xml:space="preserve">In case of any deviation in the scope during the duration of the assessment, both parties must agree upon the same in writing. Also, Company name shall have to pay additional amount based on the hours required by CyberSmithSECURE resources to fulfil the deviation. The charges for the same are as follows:</w:t>
+        <w:t xml:space="preserve">In case of any deviation in the scope during the duration of the assessment, both parties must agree upon the same in writing. Also, {{ client_name }} shall have to pay additional amount based on the hours required by CyberSmithSECURE resources to fulfil the deviation. The charges for the same are as follows:</w:t>
       </w:r>
       <w:r>
         <w:rPr>
@@ -37490,7 +37450,7 @@
     <w:sdt>
       <w:sdtPr>
         <w:lock w:val="contentLocked"/>
-        <w:id w:val="-1468637128"/>
+        <w:id w:val="-1312029531"/>
         <w:tag w:val="goog_rdk_0"/>
       </w:sdtPr>
       <w:sdtContent>
@@ -38182,7 +38142,7 @@
           <w:vertAlign w:val="baseline"/>
           <w:rtl w:val="0"/>
         </w:rPr>
-        <w:t xml:space="preserve">XYZ LLC</w:t>
+        <w:t xml:space="preserve">{{ client_name }}</w:t>
       </w:r>
       <w:r>
         <w:rPr>
@@ -38500,7 +38460,7 @@
           <w:vertAlign w:val="baseline"/>
           <w:rtl w:val="0"/>
         </w:rPr>
-        <w:t xml:space="preserve">XYZ LLC</w:t>
+        <w:t xml:space="preserve">{{ client_name }}</w:t>
       </w:r>
       <w:r>
         <w:rPr>
@@ -39348,7 +39308,7 @@
           <w:vertAlign w:val="baseline"/>
           <w:rtl w:val="0"/>
         </w:rPr>
-        <w:t xml:space="preserve">XYZ LLC</w:t>
+        <w:t xml:space="preserve">{{ client_name }}</w:t>
       </w:r>
       <w:r>
         <w:rPr>
@@ -39367,7 +39327,7 @@
           <w:vertAlign w:val="baseline"/>
           <w:rtl w:val="0"/>
         </w:rPr>
-        <w:t xml:space="preserve"> upon mutual agreement and request by XYZ LLC.</w:t>
+        <w:t xml:space="preserve"> upon mutual agreement and request by {{ client_name }}.</w:t>
       </w:r>
     </w:p>
     <w:p>
@@ -41366,7 +41326,7 @@
           <w:vertAlign w:val="baseline"/>
           <w:rtl w:val="0"/>
         </w:rPr>
-        <w:t xml:space="preserve">XYZ LLC</w:t>
+        <w:t xml:space="preserve">{{ client_name }}</w:t>
       </w:r>
       <w:r>
         <w:rPr>
@@ -42565,7 +42525,7 @@
           <w:vertAlign w:val="baseline"/>
           <w:rtl w:val="0"/>
         </w:rPr>
-        <w:t xml:space="preserve">XYZ LLC</w:t>
+        <w:t xml:space="preserve">{{ client_name }}</w:t>
       </w:r>
       <w:r>
         <w:rPr>
@@ -42998,7 +42958,7 @@
           <w:vertAlign w:val="baseline"/>
           <w:rtl w:val="0"/>
         </w:rPr>
-        <w:t xml:space="preserve">XYZ LLC</w:t>
+        <w:t xml:space="preserve">{{ client_name }}</w:t>
       </w:r>
       <w:r>
         <w:rPr>
@@ -43472,7 +43432,7 @@
           <w:vertAlign w:val="baseline"/>
           <w:rtl w:val="0"/>
         </w:rPr>
-        <w:t xml:space="preserve">XYZ LLC</w:t>
+        <w:t xml:space="preserve">{{ client_name }}</w:t>
       </w:r>
       <w:r>
         <w:rPr>
@@ -44134,7 +44094,7 @@
     <w:sdt>
       <w:sdtPr>
         <w:lock w:val="contentLocked"/>
-        <w:id w:val="2108253465"/>
+        <w:id w:val="-1932435561"/>
         <w:tag w:val="goog_rdk_1"/>
       </w:sdtPr>
       <w:sdtContent>
@@ -45298,7 +45258,7 @@
           <w:szCs w:val="24"/>
           <w:rtl w:val="0"/>
         </w:rPr>
-        <w:t xml:space="preserve">Once the final report is submitted to the team of Company name the invoice shall be raised by CyberSmithSECURE.</w:t>
+        <w:t xml:space="preserve">Once the final report is submitted to the team of {{ client_name }} the invoice shall be raised by CyberSmithSECURE.</w:t>
       </w:r>
     </w:p>
     <w:p>
@@ -45326,7 +45286,7 @@
           <w:szCs w:val="24"/>
           <w:rtl w:val="0"/>
         </w:rPr>
-        <w:t xml:space="preserve">Company name will pay the remaining 50% of the amount within 5 days of the said invoice being raised.</w:t>
+        <w:t xml:space="preserve">{{ client_name }} will pay the remaining 50% of the amount within 5 days of the said invoice being raised.</w:t>
       </w:r>
     </w:p>
     <w:p>
@@ -45384,7 +45344,7 @@
           <w:szCs w:val="24"/>
           <w:rtl w:val="0"/>
         </w:rPr>
-        <w:t xml:space="preserve">Company name</w:t>
+        <w:t xml:space="preserve">{{ client_name }}</w:t>
       </w:r>
       <w:r>
         <w:rPr>
@@ -45517,7 +45477,7 @@
           <w:szCs w:val="24"/>
           <w:rtl w:val="0"/>
         </w:rPr>
-        <w:t xml:space="preserve">CyberSmithSECURE Pvt. Ltd.                                                Company name Ltd.</w:t>
+        <w:t xml:space="preserve">CyberSmithSECURE Pvt. Ltd.                                                {{ client_name }} Ltd.</w:t>
       </w:r>
       <w:r>
         <w:rPr>
@@ -46151,12 +46111,12 @@
               <wp:extent cx="7560310" cy="784860"/>
               <wp:effectExtent b="0" l="0" r="0" t="0"/>
               <wp:wrapNone/>
-              <wp:docPr id="4" name="image11.png"/>
+              <wp:docPr id="4" name="image14.png"/>
               <a:graphic>
                 <a:graphicData uri="http://schemas.openxmlformats.org/drawingml/2006/picture">
                   <pic:pic>
                     <pic:nvPicPr>
-                      <pic:cNvPr id="0" name="image11.png"/>
+                      <pic:cNvPr id="0" name="image14.png"/>
                       <pic:cNvPicPr preferRelativeResize="0"/>
                     </pic:nvPicPr>
                     <pic:blipFill>
@@ -46368,12 +46328,12 @@
               <wp:extent cx="7560310" cy="784860"/>
               <wp:effectExtent b="0" l="0" r="0" t="0"/>
               <wp:wrapNone/>
-              <wp:docPr id="1" name="image8.png"/>
+              <wp:docPr id="1" name="image11.png"/>
               <a:graphic>
                 <a:graphicData uri="http://schemas.openxmlformats.org/drawingml/2006/picture">
                   <pic:pic>
                     <pic:nvPicPr>
-                      <pic:cNvPr id="0" name="image8.png"/>
+                      <pic:cNvPr id="0" name="image11.png"/>
                       <pic:cNvPicPr preferRelativeResize="0"/>
                     </pic:nvPicPr>
                     <pic:blipFill>
@@ -46585,12 +46545,12 @@
               <wp:extent cx="7560310" cy="784860"/>
               <wp:effectExtent b="0" l="0" r="0" t="0"/>
               <wp:wrapNone/>
-              <wp:docPr id="5" name="image12.png"/>
+              <wp:docPr id="5" name="image15.png"/>
               <a:graphic>
                 <a:graphicData uri="http://schemas.openxmlformats.org/drawingml/2006/picture">
                   <pic:pic>
                     <pic:nvPicPr>
-                      <pic:cNvPr id="0" name="image12.png"/>
+                      <pic:cNvPr id="0" name="image15.png"/>
                       <pic:cNvPicPr preferRelativeResize="0"/>
                     </pic:nvPicPr>
                     <pic:blipFill>
@@ -46737,12 +46697,12 @@
           <wp:extent cx="7560309" cy="784606"/>
           <wp:effectExtent b="0" l="0" r="0" t="0"/>
           <wp:wrapNone/>
-          <wp:docPr id="14" name="image2.jpg"/>
+          <wp:docPr id="14" name="image10.jpg"/>
           <a:graphic>
             <a:graphicData uri="http://schemas.openxmlformats.org/drawingml/2006/picture">
               <pic:pic>
                 <pic:nvPicPr>
-                  <pic:cNvPr id="0" name="image2.jpg"/>
+                  <pic:cNvPr id="0" name="image10.jpg"/>
                   <pic:cNvPicPr preferRelativeResize="0"/>
                 </pic:nvPicPr>
                 <pic:blipFill>
@@ -46952,12 +46912,12 @@
               <wp:extent cx="7560310" cy="784860"/>
               <wp:effectExtent b="0" l="0" r="0" t="0"/>
               <wp:wrapNone/>
-              <wp:docPr id="2" name="image9.png"/>
+              <wp:docPr id="2" name="image12.png"/>
               <a:graphic>
                 <a:graphicData uri="http://schemas.openxmlformats.org/drawingml/2006/picture">
                   <pic:pic>
                     <pic:nvPicPr>
-                      <pic:cNvPr id="0" name="image9.png"/>
+                      <pic:cNvPr id="0" name="image12.png"/>
                       <pic:cNvPicPr preferRelativeResize="0"/>
                     </pic:nvPicPr>
                     <pic:blipFill>
@@ -47050,12 +47010,12 @@
           <wp:extent cx="7560309" cy="777240"/>
           <wp:effectExtent b="0" l="0" r="0" t="0"/>
           <wp:wrapNone/>
-          <wp:docPr id="20" name="image7.jpg"/>
+          <wp:docPr id="20" name="image2.jpg"/>
           <a:graphic>
             <a:graphicData uri="http://schemas.openxmlformats.org/drawingml/2006/picture">
               <pic:pic>
                 <pic:nvPicPr>
-                  <pic:cNvPr id="0" name="image7.jpg"/>
+                  <pic:cNvPr id="0" name="image2.jpg"/>
                   <pic:cNvPicPr preferRelativeResize="0"/>
                 </pic:nvPicPr>
                 <pic:blipFill>
@@ -47151,12 +47111,12 @@
           <wp:extent cx="7560309" cy="777240"/>
           <wp:effectExtent b="0" l="0" r="0" t="0"/>
           <wp:wrapNone/>
-          <wp:docPr id="11" name="image7.jpg"/>
+          <wp:docPr id="11" name="image2.jpg"/>
           <a:graphic>
             <a:graphicData uri="http://schemas.openxmlformats.org/drawingml/2006/picture">
               <pic:pic>
                 <pic:nvPicPr>
-                  <pic:cNvPr id="0" name="image7.jpg"/>
+                  <pic:cNvPr id="0" name="image2.jpg"/>
                   <pic:cNvPicPr preferRelativeResize="0"/>
                 </pic:nvPicPr>
                 <pic:blipFill>
@@ -47252,12 +47212,12 @@
           <wp:extent cx="7560309" cy="777240"/>
           <wp:effectExtent b="0" l="0" r="0" t="0"/>
           <wp:wrapNone/>
-          <wp:docPr id="10" name="image7.jpg"/>
+          <wp:docPr id="10" name="image2.jpg"/>
           <a:graphic>
             <a:graphicData uri="http://schemas.openxmlformats.org/drawingml/2006/picture">
               <pic:pic>
                 <pic:nvPicPr>
-                  <pic:cNvPr id="0" name="image7.jpg"/>
+                  <pic:cNvPr id="0" name="image2.jpg"/>
                   <pic:cNvPicPr preferRelativeResize="0"/>
                 </pic:nvPicPr>
                 <pic:blipFill>
@@ -47353,12 +47313,12 @@
           <wp:extent cx="7560309" cy="777240"/>
           <wp:effectExtent b="0" l="0" r="0" t="0"/>
           <wp:wrapNone/>
-          <wp:docPr id="15" name="image7.jpg"/>
+          <wp:docPr id="15" name="image2.jpg"/>
           <a:graphic>
             <a:graphicData uri="http://schemas.openxmlformats.org/drawingml/2006/picture">
               <pic:pic>
                 <pic:nvPicPr>
-                  <pic:cNvPr id="0" name="image7.jpg"/>
+                  <pic:cNvPr id="0" name="image2.jpg"/>
                   <pic:cNvPicPr preferRelativeResize="0"/>
                 </pic:nvPicPr>
                 <pic:blipFill>
@@ -47454,12 +47414,12 @@
           <wp:extent cx="7560309" cy="777240"/>
           <wp:effectExtent b="0" l="0" r="0" t="0"/>
           <wp:wrapNone/>
-          <wp:docPr id="16" name="image7.jpg"/>
+          <wp:docPr id="16" name="image2.jpg"/>
           <a:graphic>
             <a:graphicData uri="http://schemas.openxmlformats.org/drawingml/2006/picture">
               <pic:pic>
                 <pic:nvPicPr>
-                  <pic:cNvPr id="0" name="image7.jpg"/>
+                  <pic:cNvPr id="0" name="image2.jpg"/>
                   <pic:cNvPicPr preferRelativeResize="0"/>
                 </pic:nvPicPr>
                 <pic:blipFill>

</xml_diff>